<commit_message>
Remove byline from TEF proposal docx
Co-Authored-By: Claude Sonnet 5.5 <noreply@anthropic.com>
Claude-Session: https://claude.ai/code/session_01WiBnBeNuuswtpuGnzBwLUc
</commit_message>
<xml_diff>
--- a/outputs/TEF_Proposal_Business_Plan_Financials_Pitch_Video_Review_SIC.docx
+++ b/outputs/TEF_Proposal_Business_Plan_Financials_Pitch_Video_Review_SIC.docx
@@ -8,18 +8,6 @@
       </w:pPr>
       <w:r>
         <w:t xml:space="preserve">Proposal: Business Plan, Financials &amp; Pitch Video Review Services | Tony Elumelu Foundation</w:t>
-      </w:r>
-    </w:p>
-    <w:p>
-      <w:pPr/>
-      <w:r>
-        <w:t xml:space="preserve">Oct 1, 2026</w:t>
-      </w:r>
-      <w:r>
-        <w:t xml:space="preserve"> · </w:t>
-      </w:r>
-      <w:r>
-        <w:t xml:space="preserve">@Anastasia Muthoni</w:t>
       </w:r>
     </w:p>
     <w:p>

</xml_diff>